<commit_message>
Offre contrastée : harmonisation du discours sur l'association
Mission « Piloter » sans la mention « en autonomie » ; section 04 :
« perspective d'association jalonnée d'étapes claires » au lieu de
« jalonnée dans le temps ». Le sous-titre « possible association » était
déjà remplacé par la phrase clé dans cette version.

Co-Authored-By: Claude Opus 5.5 <noreply@anthropic.com>
Claude-Session: https://claude.ai/code/session_017zLT3dFfTsN6o1Gwcudkmu
</commit_message>
<xml_diff>
--- a/outils/offre-emploi-avocat/Offre_emploi_avocat_version_contrastee.docx
+++ b/outils/offre-emploi-avocat/Offre_emploi_avocat_version_contrastee.docx
@@ -592,7 +592,7 @@
                       <w:sz w:val="15"/>
                       <w:szCs w:val="15"/>
                     </w:rPr>
-                    <w:t xml:space="preserve">en autonomie un portefeuille de dossiers jusqu’à l’indemnisation définitive</w:t>
+                    <w:t xml:space="preserve">un portefeuille de dossiers jusqu’à l’indemnisation définitive</w:t>
                   </w:r>
                 </w:p>
               </w:tc>
@@ -2155,7 +2155,7 @@
                 <w:sz w:val="18"/>
                 <w:szCs w:val="18"/>
               </w:rPr>
-              <w:t xml:space="preserve">perspective d’association jalonnée dans le temps</w:t>
+              <w:t xml:space="preserve">perspective d’association jalonnée d’étapes claires</w:t>
             </w:r>
             <w:r>
               <w:rPr>

</xml_diff>

<commit_message>
Offre contrastée : section 04 reformulée (association par étapes)
« Vous avancez vers l'association par étapes. Vous prendrez en charge des
responsabilités progressivement. » remplace la phrase sur le périmètre de
responsabilités, la latitude de décision et l'exposition client.

Co-Authored-By: Claude Opus 5.5 <noreply@anthropic.com>
Claude-Session: https://claude.ai/code/session_017zLT3dFfTsN6o1Gwcudkmu
</commit_message>
<xml_diff>
--- a/outils/offre-emploi-avocat/Offre_emploi_avocat_version_contrastee.docx
+++ b/outils/offre-emploi-avocat/Offre_emploi_avocat_version_contrastee.docx
@@ -2141,21 +2141,12 @@
             </w:pPr>
             <w:r>
               <w:rPr>
-                <w:rFonts w:ascii="Open Sans" w:cs="Open Sans" w:eastAsia="Open Sans" w:hAnsi="Open Sans"/>
-                <w:color w:val="262626"/>
-                <w:sz w:val="18"/>
-                <w:szCs w:val="18"/>
-              </w:rPr>
-              <w:t xml:space="preserve">Une </w:t>
-            </w:r>
-            <w:r>
-              <w:rPr>
                 <w:rFonts w:ascii="Open Sans SemiBold" w:cs="Open Sans SemiBold" w:eastAsia="Open Sans SemiBold" w:hAnsi="Open Sans SemiBold"/>
                 <w:color w:val="262626"/>
                 <w:sz w:val="18"/>
                 <w:szCs w:val="18"/>
               </w:rPr>
-              <w:t xml:space="preserve">perspective d’association jalonnée d’étapes claires</w:t>
+              <w:t xml:space="preserve">Vous avancez vers l’association par étapes.</w:t>
             </w:r>
             <w:r>
               <w:rPr>
@@ -2164,7 +2155,7 @@
                 <w:sz w:val="18"/>
                 <w:szCs w:val="18"/>
               </w:rPr>
-              <w:t xml:space="preserve">, et un périmètre de responsabilités large, avec une vraie latitude de décision et une exposition client directe.</w:t>
+              <w:t xml:space="preserve"> Vous prendrez en charge des responsabilités progressivement.</w:t>
             </w:r>
           </w:p>
           <w:tbl>

</xml_diff>

<commit_message>
Offre d'emploi contrastée : refonte du pied de page du verso
Bloc orange d'appel à candidater, trois repères pratiques alignés aux
couleurs du liseré, filet et ligne de pied allégée. Le liseré tricolore
est désormais visible sur le verso et les numéros de page sont homogènes.

Co-Authored-By: Claude Opus 5.5 <noreply@anthropic.com>
Claude-Session: https://claude.ai/code/session_017zLT3dFfTsN6o1Gwcudkmu
</commit_message>
<xml_diff>
--- a/outils/offre-emploi-avocat/Offre_emploi_avocat_version_contrastee.docx
+++ b/outils/offre-emploi-avocat/Offre_emploi_avocat_version_contrastee.docx
@@ -2581,7 +2581,7 @@
 <w:ftr xmlns:wpc="http://schemas.microsoft.com/office/word/2010/wordprocessingCanvas" xmlns:mc="http://schemas.openxmlformats.org/markup-compatibility/2006" xmlns:o="urn:schemas-microsoft-com:office:office" xmlns:r="http://schemas.openxmlformats.org/officeDocument/2006/relationships" xmlns:m="http://schemas.openxmlformats.org/officeDocument/2006/math" xmlns:v="urn:schemas-microsoft-com:vml" xmlns:wp14="http://schemas.microsoft.com/office/word/2010/wordprocessingDrawing" xmlns:wp="http://schemas.openxmlformats.org/drawingml/2006/wordprocessingDrawing" xmlns:w10="urn:schemas-microsoft-com:office:word" xmlns:w="http://schemas.openxmlformats.org/wordprocessingml/2006/main" xmlns:w14="http://schemas.microsoft.com/office/word/2010/wordml" xmlns:w15="http://schemas.microsoft.com/office/word/2012/wordml" xmlns:wpg="http://schemas.microsoft.com/office/word/2010/wordprocessingGroup" xmlns:wpi="http://schemas.microsoft.com/office/word/2010/wordprocessingInk" xmlns:wne="http://schemas.microsoft.com/office/word/2006/wordml" xmlns:wps="http://schemas.microsoft.com/office/word/2010/wordprocessingShape">
   <w:p>
     <w:pPr>
-      <w:spacing w:after="10"/>
+      <w:spacing w:after="0" w:line="20" w:lineRule="exact"/>
     </w:pPr>
     <w:r>
       <w:drawing>
@@ -2631,53 +2631,6 @@
         </wp:anchor>
       </w:drawing>
     </w:r>
-    <w:r>
-      <w:rPr>
-        <w:rFonts w:ascii="Poppins Medium" w:cs="Poppins Medium" w:eastAsia="Poppins Medium" w:hAnsi="Poppins Medium"/>
-        <w:color w:val="FCAF19"/>
-        <w:spacing w:val="30"/>
-        <w:sz w:val="13"/>
-        <w:szCs w:val="13"/>
-      </w:rPr>
-      <w:t xml:space="preserve">INFORMATIONS PRATIQUES</w:t>
-    </w:r>
-  </w:p>
-  <w:p>
-    <w:pPr>
-      <w:spacing w:after="30"/>
-    </w:pPr>
-    <w:r>
-      <w:rPr>
-        <w:rFonts w:ascii="Poppins SemiBold" w:cs="Poppins SemiBold" w:eastAsia="Poppins SemiBold" w:hAnsi="Poppins SemiBold"/>
-        <w:color w:val="FFFFFF"/>
-        <w:sz w:val="29"/>
-        <w:szCs w:val="29"/>
-      </w:rPr>
-      <w:t xml:space="preserve">Comment candidater ?</w:t>
-    </w:r>
-  </w:p>
-  <w:p>
-    <w:pPr>
-      <w:spacing w:after="140"/>
-    </w:pPr>
-    <w:r>
-      <w:rPr>
-        <w:rFonts w:ascii="Open Sans SemiBold" w:cs="Open Sans SemiBold" w:eastAsia="Open Sans SemiBold" w:hAnsi="Open Sans SemiBold"/>
-        <w:color w:val="FFFFFF"/>
-        <w:sz w:val="16"/>
-        <w:szCs w:val="16"/>
-      </w:rPr>
-      <w:t xml:space="preserve">Nous étudions toutes les candidatures</w:t>
-    </w:r>
-    <w:r>
-      <w:rPr>
-        <w:rFonts w:ascii="Open Sans" w:cs="Open Sans" w:eastAsia="Open Sans" w:hAnsi="Open Sans"/>
-        <w:color w:val="FAF0C7"/>
-        <w:sz w:val="16"/>
-        <w:szCs w:val="16"/>
-      </w:rPr>
-      <w:t xml:space="preserve"> et nous nous engageons à répondre à chacune.</w:t>
-    </w:r>
   </w:p>
   <w:tbl>
     <w:tblPr>
@@ -2693,10 +2646,9 @@
       <w:tblLayout w:type="fixed"/>
     </w:tblPr>
     <w:tblGrid>
-      <w:gridCol w:w="2523"/>
-      <w:gridCol w:w="2523"/>
-      <w:gridCol w:w="2523"/>
-      <w:gridCol w:w="2523"/>
+      <w:gridCol w:w="5330"/>
+      <w:gridCol w:w="340"/>
+      <w:gridCol w:w="4422"/>
     </w:tblGrid>
     <w:tr>
       <w:trPr>
@@ -2704,7 +2656,7 @@
       </w:trPr>
       <w:tc>
         <w:tcPr>
-          <w:tcW w:type="dxa" w:w="2523"/>
+          <w:tcW w:type="dxa" w:w="5330"/>
           <w:tcBorders>
             <w:top w:val="none" w:color="FFFFFF" w:sz="0"/>
             <w:left w:val="none" w:color="FFFFFF" w:sz="0"/>
@@ -2715,109 +2667,348 @@
             <w:top w:type="dxa" w:w="0"/>
             <w:left w:type="dxa" w:w="0"/>
             <w:bottom w:type="dxa" w:w="0"/>
-            <w:right w:type="dxa" w:w="110"/>
+            <w:right w:type="dxa" w:w="0"/>
           </w:tcMar>
           <w:vAlign w:val="top"/>
         </w:tcPr>
         <w:p>
           <w:pPr>
-            <w:spacing w:after="70"/>
+            <w:spacing w:after="20"/>
           </w:pPr>
           <w:r>
-            <w:drawing>
-              <wp:inline distT="0" distB="0" distL="0" distR="0">
-                <wp:extent cx="306000" cy="306000"/>
-                <wp:effectExtent t="0" r="0" b="0" l="0"/>
-                <wp:docPr id="1" name="" descr="" title=""/>
-                <wp:cNvGraphicFramePr>
-                  <a:graphicFrameLocks xmlns:a="http://schemas.openxmlformats.org/drawingml/2006/main" noChangeAspect="1"/>
-                </wp:cNvGraphicFramePr>
-                <a:graphic xmlns:a="http://schemas.openxmlformats.org/drawingml/2006/main">
-                  <a:graphicData uri="http://schemas.openxmlformats.org/drawingml/2006/picture">
-                    <pic:pic xmlns:pic="http://schemas.openxmlformats.org/drawingml/2006/picture">
-                      <pic:nvPicPr>
-                        <pic:cNvPr id="0" name="" descr=""/>
-                        <pic:cNvPicPr>
-                          <a:picLocks noChangeAspect="1" noChangeArrowheads="1"/>
-                        </pic:cNvPicPr>
-                      </pic:nvPicPr>
-                      <pic:blipFill>
-                        <a:blip r:embed="rId1" cstate="none"/>
-                        <a:srcRect/>
-                        <a:stretch>
-                          <a:fillRect/>
-                        </a:stretch>
-                      </pic:blipFill>
-                      <pic:spPr bwMode="auto">
-                        <a:xfrm>
-                          <a:off x="0" y="0"/>
-                          <a:ext cx="306000" cy="306000"/>
-                        </a:xfrm>
-                        <a:prstGeom prst="rect">
-                          <a:avLst/>
-                        </a:prstGeom>
-                      </pic:spPr>
-                    </pic:pic>
-                  </a:graphicData>
-                </a:graphic>
-              </wp:inline>
-            </w:drawing>
+            <w:rPr>
+              <w:rFonts w:ascii="Poppins Medium" w:cs="Poppins Medium" w:eastAsia="Poppins Medium" w:hAnsi="Poppins Medium"/>
+              <w:color w:val="FCAF19"/>
+              <w:spacing w:val="30"/>
+              <w:sz w:val="13"/>
+              <w:szCs w:val="13"/>
+            </w:rPr>
+            <w:t xml:space="preserve">INFORMATIONS PRATIQUES</w:t>
           </w:r>
         </w:p>
         <w:p>
           <w:pPr>
-            <w:spacing w:after="20" w:line="235" w:lineRule="auto"/>
+            <w:spacing w:after="40" w:line="240" w:lineRule="auto"/>
           </w:pPr>
           <w:r>
             <w:rPr>
               <w:rFonts w:ascii="Poppins SemiBold" w:cs="Poppins SemiBold" w:eastAsia="Poppins SemiBold" w:hAnsi="Poppins SemiBold"/>
               <w:color w:val="FFFFFF"/>
-              <w:sz w:val="17"/>
-              <w:szCs w:val="17"/>
+              <w:sz w:val="29"/>
+              <w:szCs w:val="29"/>
             </w:rPr>
-            <w:t xml:space="preserve">Lieu et prise de poste</w:t>
+            <w:t xml:space="preserve">Comment candidater ?</w:t>
           </w:r>
         </w:p>
         <w:p>
           <w:pPr>
-            <w:spacing w:after="20" w:line="235" w:lineRule="auto"/>
+            <w:spacing w:after="0" w:line="259" w:lineRule="auto"/>
           </w:pPr>
           <w:r>
             <w:rPr>
               <w:rFonts w:ascii="Open Sans SemiBold" w:cs="Open Sans SemiBold" w:eastAsia="Open Sans SemiBold" w:hAnsi="Open Sans SemiBold"/>
-              <w:color w:val="FCAF19"/>
-              <w:sz w:val="15"/>
-              <w:szCs w:val="15"/>
+              <w:color w:val="FFFFFF"/>
+              <w:sz w:val="16"/>
+              <w:szCs w:val="16"/>
             </w:rPr>
-            <w:t xml:space="preserve">Grenoble (38)</w:t>
+            <w:t xml:space="preserve">Nous étudions toutes les candidatures</w:t>
+          </w:r>
+          <w:r>
+            <w:rPr>
+              <w:rFonts w:ascii="Open Sans" w:cs="Open Sans" w:eastAsia="Open Sans" w:hAnsi="Open Sans"/>
+              <w:color w:val="FAF0C7"/>
+              <w:sz w:val="16"/>
+              <w:szCs w:val="16"/>
+            </w:rPr>
+            <w:br/>
+            <w:t xml:space="preserve">et nous nous engageons à répondre à chacune.</w:t>
           </w:r>
         </w:p>
       </w:tc>
       <w:tc>
         <w:tcPr>
-          <w:tcW w:type="dxa" w:w="2523"/>
+          <w:tcW w:type="dxa" w:w="340"/>
           <w:tcBorders>
             <w:top w:val="none" w:color="FFFFFF" w:sz="0"/>
-            <w:left w:val="single" w:color="5B7385" w:sz="4"/>
+            <w:left w:val="none" w:color="FFFFFF" w:sz="0"/>
             <w:bottom w:val="none" w:color="FFFFFF" w:sz="0"/>
             <w:right w:val="none" w:color="FFFFFF" w:sz="0"/>
           </w:tcBorders>
           <w:tcMar>
             <w:top w:type="dxa" w:w="0"/>
-            <w:left w:type="dxa" w:w="170"/>
+            <w:left w:type="dxa" w:w="0"/>
             <w:bottom w:type="dxa" w:w="0"/>
-            <w:right w:type="dxa" w:w="110"/>
+            <w:right w:type="dxa" w:w="0"/>
           </w:tcMar>
           <w:vAlign w:val="top"/>
         </w:tcPr>
         <w:p>
           <w:pPr>
-            <w:spacing w:after="70"/>
+            <w:spacing w:after="0" w:line="259" w:lineRule="auto"/>
+          </w:pPr>
+        </w:p>
+      </w:tc>
+      <w:tc>
+        <w:tcPr>
+          <w:tcW w:type="dxa" w:w="4422"/>
+          <w:tcBorders>
+            <w:top w:val="none" w:color="FFFFFF" w:sz="0"/>
+            <w:left w:val="none" w:color="FFFFFF" w:sz="0"/>
+            <w:bottom w:val="none" w:color="FFFFFF" w:sz="0"/>
+            <w:right w:val="none" w:color="FFFFFF" w:sz="0"/>
+          </w:tcBorders>
+          <w:tcMar>
+            <w:top w:type="dxa" w:w="0"/>
+            <w:left w:type="dxa" w:w="0"/>
+            <w:bottom w:type="dxa" w:w="0"/>
+            <w:right w:type="dxa" w:w="0"/>
+          </w:tcMar>
+          <w:vAlign w:val="bottom"/>
+        </w:tcPr>
+        <w:tbl>
+          <w:tblPr>
+            <w:tblW w:type="dxa" w:w="4422"/>
+            <w:tblBorders>
+              <w:top w:val="none" w:color="FFFFFF" w:sz="0"/>
+              <w:left w:val="none" w:color="FFFFFF" w:sz="0"/>
+              <w:bottom w:val="none" w:color="FFFFFF" w:sz="0"/>
+              <w:right w:val="none" w:color="FFFFFF" w:sz="0"/>
+              <w:insideH w:val="none" w:color="FFFFFF" w:sz="0"/>
+              <w:insideV w:val="none" w:color="FFFFFF" w:sz="0"/>
+            </w:tblBorders>
+            <w:tblLayout w:type="fixed"/>
+          </w:tblPr>
+          <w:tblGrid>
+            <w:gridCol w:w="4422"/>
+          </w:tblGrid>
+          <w:tr>
+            <w:trPr>
+              <w:cantSplit/>
+            </w:trPr>
+            <w:tc>
+              <w:tcPr>
+                <w:tcW w:type="dxa" w:w="4422"/>
+                <w:tcBorders>
+                  <w:top w:val="none" w:color="FFFFFF" w:sz="0"/>
+                  <w:left w:val="none" w:color="FFFFFF" w:sz="0"/>
+                  <w:bottom w:val="none" w:color="FFFFFF" w:sz="0"/>
+                  <w:right w:val="none" w:color="FFFFFF" w:sz="0"/>
+                </w:tcBorders>
+                <w:shd w:fill="FCAF19" w:color="auto" w:val="clear"/>
+                <w:tcMar>
+                  <w:top w:type="dxa" w:w="150"/>
+                  <w:left w:type="dxa" w:w="200"/>
+                  <w:bottom w:type="dxa" w:w="150"/>
+                  <w:right w:type="dxa" w:w="200"/>
+                </w:tcMar>
+                <w:vAlign w:val="top"/>
+              </w:tcPr>
+              <w:tbl>
+                <w:tblPr>
+                  <w:tblW w:type="dxa" w:w="4022"/>
+                  <w:tblBorders>
+                    <w:top w:val="none" w:color="FFFFFF" w:sz="0"/>
+                    <w:left w:val="none" w:color="FFFFFF" w:sz="0"/>
+                    <w:bottom w:val="none" w:color="FFFFFF" w:sz="0"/>
+                    <w:right w:val="none" w:color="FFFFFF" w:sz="0"/>
+                    <w:insideH w:val="none" w:color="FFFFFF" w:sz="0"/>
+                    <w:insideV w:val="none" w:color="FFFFFF" w:sz="0"/>
+                  </w:tblBorders>
+                  <w:tblLayout w:type="fixed"/>
+                </w:tblPr>
+                <w:tblGrid>
+                  <w:gridCol w:w="680"/>
+                  <w:gridCol w:w="3342"/>
+                </w:tblGrid>
+                <w:tr>
+                  <w:trPr>
+                    <w:cantSplit/>
+                  </w:trPr>
+                  <w:tc>
+                    <w:tcPr>
+                      <w:tcW w:type="dxa" w:w="680"/>
+                      <w:tcBorders>
+                        <w:top w:val="none" w:color="FFFFFF" w:sz="0"/>
+                        <w:left w:val="none" w:color="FFFFFF" w:sz="0"/>
+                        <w:bottom w:val="none" w:color="FFFFFF" w:sz="0"/>
+                        <w:right w:val="none" w:color="FFFFFF" w:sz="0"/>
+                      </w:tcBorders>
+                      <w:tcMar>
+                        <w:top w:type="dxa" w:w="0"/>
+                        <w:left w:type="dxa" w:w="0"/>
+                        <w:bottom w:type="dxa" w:w="0"/>
+                        <w:right w:type="dxa" w:w="0"/>
+                      </w:tcMar>
+                      <w:vAlign w:val="center"/>
+                    </w:tcPr>
+                    <w:p>
+                      <w:pPr>
+                        <w:spacing w:after="0" w:line="240" w:lineRule="auto"/>
+                      </w:pPr>
+                      <w:r>
+                        <w:drawing>
+                          <wp:inline distT="0" distB="0" distL="0" distR="0">
+                            <wp:extent cx="306000" cy="306000"/>
+                            <wp:effectExtent t="0" r="0" b="0" l="0"/>
+                            <wp:docPr id="1" name="" descr="" title=""/>
+                            <wp:cNvGraphicFramePr>
+                              <a:graphicFrameLocks xmlns:a="http://schemas.openxmlformats.org/drawingml/2006/main" noChangeAspect="1"/>
+                            </wp:cNvGraphicFramePr>
+                            <a:graphic xmlns:a="http://schemas.openxmlformats.org/drawingml/2006/main">
+                              <a:graphicData uri="http://schemas.openxmlformats.org/drawingml/2006/picture">
+                                <pic:pic xmlns:pic="http://schemas.openxmlformats.org/drawingml/2006/picture">
+                                  <pic:nvPicPr>
+                                    <pic:cNvPr id="0" name="" descr=""/>
+                                    <pic:cNvPicPr>
+                                      <a:picLocks noChangeAspect="1" noChangeArrowheads="1"/>
+                                    </pic:cNvPicPr>
+                                  </pic:nvPicPr>
+                                  <pic:blipFill>
+                                    <a:blip r:embed="rId1" cstate="none"/>
+                                    <a:srcRect/>
+                                    <a:stretch>
+                                      <a:fillRect/>
+                                    </a:stretch>
+                                  </pic:blipFill>
+                                  <pic:spPr bwMode="auto">
+                                    <a:xfrm>
+                                      <a:off x="0" y="0"/>
+                                      <a:ext cx="306000" cy="306000"/>
+                                    </a:xfrm>
+                                    <a:prstGeom prst="rect">
+                                      <a:avLst/>
+                                    </a:prstGeom>
+                                  </pic:spPr>
+                                </pic:pic>
+                              </a:graphicData>
+                            </a:graphic>
+                          </wp:inline>
+                        </w:drawing>
+                      </w:r>
+                    </w:p>
+                  </w:tc>
+                  <w:tc>
+                    <w:tcPr>
+                      <w:tcW w:type="dxa" w:w="3342"/>
+                      <w:tcBorders>
+                        <w:top w:val="none" w:color="FFFFFF" w:sz="0"/>
+                        <w:left w:val="none" w:color="FFFFFF" w:sz="0"/>
+                        <w:bottom w:val="none" w:color="FFFFFF" w:sz="0"/>
+                        <w:right w:val="none" w:color="FFFFFF" w:sz="0"/>
+                      </w:tcBorders>
+                      <w:tcMar>
+                        <w:top w:type="dxa" w:w="0"/>
+                        <w:left w:type="dxa" w:w="0"/>
+                        <w:bottom w:type="dxa" w:w="0"/>
+                        <w:right w:type="dxa" w:w="0"/>
+                      </w:tcMar>
+                      <w:vAlign w:val="center"/>
+                    </w:tcPr>
+                    <w:p>
+                      <w:pPr>
+                        <w:spacing w:after="30"/>
+                      </w:pPr>
+                      <w:r>
+                        <w:rPr>
+                          <w:rFonts w:ascii="Poppins Medium" w:cs="Poppins Medium" w:eastAsia="Poppins Medium" w:hAnsi="Poppins Medium"/>
+                          <w:color w:val="304859"/>
+                          <w:spacing w:val="30"/>
+                          <w:sz w:val="12"/>
+                          <w:szCs w:val="12"/>
+                        </w:rPr>
+                        <w:t xml:space="preserve">ENVOYEZ CV ET LETTRE DE MOTIVATION</w:t>
+                      </w:r>
+                    </w:p>
+                    <w:p>
+                      <w:pPr>
+                        <w:spacing w:after="0" w:line="240" w:lineRule="auto"/>
+                      </w:pPr>
+                      <w:r>
+                        <w:rPr>
+                          <w:rFonts w:ascii="Poppins SemiBold" w:cs="Poppins SemiBold" w:eastAsia="Poppins SemiBold" w:hAnsi="Poppins SemiBold"/>
+                          <w:color w:val="304859"/>
+                          <w:sz w:val="17"/>
+                          <w:szCs w:val="17"/>
+                        </w:rPr>
+                        <w:t xml:space="preserve">recrutement@victimesetprejudices.fr</w:t>
+                      </w:r>
+                    </w:p>
+                  </w:tc>
+                </w:tr>
+              </w:tbl>
+              <w:p>
+                <w:pPr>
+                  <w:spacing w:after="0" w:before="0" w:line="17" w:lineRule="exact"/>
+                </w:pPr>
+              </w:p>
+            </w:tc>
+          </w:tr>
+        </w:tbl>
+        <w:p>
+          <w:pPr>
+            <w:spacing w:after="0" w:before="0" w:line="17" w:lineRule="exact"/>
+          </w:pPr>
+        </w:p>
+      </w:tc>
+    </w:tr>
+  </w:tbl>
+  <w:p>
+    <w:pPr>
+      <w:spacing w:after="0" w:before="0" w:line="340" w:lineRule="exact"/>
+    </w:pPr>
+  </w:p>
+  <w:tbl>
+    <w:tblPr>
+      <w:tblW w:type="dxa" w:w="10092"/>
+      <w:tblBorders>
+        <w:top w:val="none" w:color="FFFFFF" w:sz="0"/>
+        <w:left w:val="none" w:color="FFFFFF" w:sz="0"/>
+        <w:bottom w:val="none" w:color="FFFFFF" w:sz="0"/>
+        <w:right w:val="none" w:color="FFFFFF" w:sz="0"/>
+        <w:insideH w:val="none" w:color="FFFFFF" w:sz="0"/>
+        <w:insideV w:val="none" w:color="FFFFFF" w:sz="0"/>
+      </w:tblBorders>
+      <w:tblLayout w:type="fixed"/>
+    </w:tblPr>
+    <w:tblGrid>
+      <w:gridCol w:w="624"/>
+      <w:gridCol w:w="2513"/>
+      <w:gridCol w:w="340"/>
+      <w:gridCol w:w="624"/>
+      <w:gridCol w:w="2513"/>
+      <w:gridCol w:w="340"/>
+      <w:gridCol w:w="624"/>
+      <w:gridCol w:w="2514"/>
+    </w:tblGrid>
+    <w:tr>
+      <w:trPr>
+        <w:cantSplit/>
+      </w:trPr>
+      <w:tc>
+        <w:tcPr>
+          <w:tcW w:type="dxa" w:w="624"/>
+          <w:tcBorders>
+            <w:top w:val="none" w:color="FFFFFF" w:sz="0"/>
+            <w:left w:val="none" w:color="FFFFFF" w:sz="0"/>
+            <w:bottom w:val="none" w:color="FFFFFF" w:sz="0"/>
+            <w:right w:val="none" w:color="FFFFFF" w:sz="0"/>
+          </w:tcBorders>
+          <w:tcMar>
+            <w:top w:type="dxa" w:w="0"/>
+            <w:left w:type="dxa" w:w="0"/>
+            <w:bottom w:type="dxa" w:w="0"/>
+            <w:right w:type="dxa" w:w="0"/>
+          </w:tcMar>
+          <w:vAlign w:val="top"/>
+        </w:tcPr>
+        <w:p>
+          <w:pPr>
+            <w:spacing w:after="0" w:line="240" w:lineRule="auto"/>
           </w:pPr>
           <w:r>
             <w:drawing>
               <wp:inline distT="0" distB="0" distL="0" distR="0">
-                <wp:extent cx="306000" cy="306000"/>
+                <wp:extent cx="288000" cy="288000"/>
                 <wp:effectExtent t="0" r="0" b="0" l="0"/>
                 <wp:docPr id="1" name="" descr="" title=""/>
                 <wp:cNvGraphicFramePr>
@@ -2842,7 +3033,7 @@
                       <pic:spPr bwMode="auto">
                         <a:xfrm>
                           <a:off x="0" y="0"/>
-                          <a:ext cx="306000" cy="306000"/>
+                          <a:ext cx="288000" cy="288000"/>
                         </a:xfrm>
                         <a:prstGeom prst="rect">
                           <a:avLst/>
@@ -2855,9 +3046,27 @@
             </w:drawing>
           </w:r>
         </w:p>
+      </w:tc>
+      <w:tc>
+        <w:tcPr>
+          <w:tcW w:type="dxa" w:w="2513"/>
+          <w:tcBorders>
+            <w:top w:val="none" w:color="FFFFFF" w:sz="0"/>
+            <w:left w:val="none" w:color="FFFFFF" w:sz="0"/>
+            <w:bottom w:val="none" w:color="FFFFFF" w:sz="0"/>
+            <w:right w:val="none" w:color="FFFFFF" w:sz="0"/>
+          </w:tcBorders>
+          <w:tcMar>
+            <w:top w:type="dxa" w:w="0"/>
+            <w:left w:type="dxa" w:w="0"/>
+            <w:bottom w:type="dxa" w:w="0"/>
+            <w:right w:type="dxa" w:w="0"/>
+          </w:tcMar>
+          <w:vAlign w:val="top"/>
+        </w:tcPr>
         <w:p>
           <w:pPr>
-            <w:spacing w:after="20" w:line="235" w:lineRule="auto"/>
+            <w:spacing w:after="10" w:line="235" w:lineRule="auto"/>
           </w:pPr>
           <w:r>
             <w:rPr>
@@ -2866,12 +3075,12 @@
               <w:sz w:val="17"/>
               <w:szCs w:val="17"/>
             </w:rPr>
-            <w:t xml:space="preserve">Contrat</w:t>
+            <w:t xml:space="preserve">Lieu</w:t>
           </w:r>
         </w:p>
         <w:p>
           <w:pPr>
-            <w:spacing w:after="20" w:line="235" w:lineRule="auto"/>
+            <w:spacing w:after="30" w:line="235" w:lineRule="auto"/>
           </w:pPr>
           <w:r>
             <w:rPr>
@@ -2880,12 +3089,12 @@
               <w:sz w:val="15"/>
               <w:szCs w:val="15"/>
             </w:rPr>
-            <w:t xml:space="preserve">CDI · statut cadre</w:t>
+            <w:t xml:space="preserve">Grenoble (38)</w:t>
           </w:r>
         </w:p>
         <w:p>
           <w:pPr>
-            <w:spacing w:after="0" w:line="235" w:lineRule="auto"/>
+            <w:spacing w:after="0" w:line="245" w:lineRule="auto"/>
           </w:pPr>
           <w:r>
             <w:rPr>
@@ -2894,35 +3103,58 @@
               <w:sz w:val="14"/>
               <w:szCs w:val="14"/>
             </w:rPr>
-            <w:t xml:space="preserve">Avocat(e) salarié(e), forfait jours (218), association future</w:t>
+            <w:t xml:space="preserve">Le cabinet est implanté à Grenoble et à Annecy</w:t>
           </w:r>
         </w:p>
       </w:tc>
       <w:tc>
         <w:tcPr>
-          <w:tcW w:type="dxa" w:w="2523"/>
+          <w:tcW w:type="dxa" w:w="340"/>
           <w:tcBorders>
             <w:top w:val="none" w:color="FFFFFF" w:sz="0"/>
-            <w:left w:val="single" w:color="5B7385" w:sz="4"/>
+            <w:left w:val="none" w:color="FFFFFF" w:sz="0"/>
             <w:bottom w:val="none" w:color="FFFFFF" w:sz="0"/>
             <w:right w:val="none" w:color="FFFFFF" w:sz="0"/>
           </w:tcBorders>
           <w:tcMar>
             <w:top w:type="dxa" w:w="0"/>
-            <w:left w:type="dxa" w:w="170"/>
+            <w:left w:type="dxa" w:w="0"/>
             <w:bottom w:type="dxa" w:w="0"/>
-            <w:right w:type="dxa" w:w="110"/>
+            <w:right w:type="dxa" w:w="0"/>
           </w:tcMar>
           <w:vAlign w:val="top"/>
         </w:tcPr>
         <w:p>
           <w:pPr>
-            <w:spacing w:after="70"/>
+            <w:spacing w:after="0" w:line="259" w:lineRule="auto"/>
+          </w:pPr>
+        </w:p>
+      </w:tc>
+      <w:tc>
+        <w:tcPr>
+          <w:tcW w:type="dxa" w:w="624"/>
+          <w:tcBorders>
+            <w:top w:val="none" w:color="FFFFFF" w:sz="0"/>
+            <w:left w:val="none" w:color="FFFFFF" w:sz="0"/>
+            <w:bottom w:val="none" w:color="FFFFFF" w:sz="0"/>
+            <w:right w:val="none" w:color="FFFFFF" w:sz="0"/>
+          </w:tcBorders>
+          <w:tcMar>
+            <w:top w:type="dxa" w:w="0"/>
+            <w:left w:type="dxa" w:w="0"/>
+            <w:bottom w:type="dxa" w:w="0"/>
+            <w:right w:type="dxa" w:w="0"/>
+          </w:tcMar>
+          <w:vAlign w:val="top"/>
+        </w:tcPr>
+        <w:p>
+          <w:pPr>
+            <w:spacing w:after="0" w:line="240" w:lineRule="auto"/>
           </w:pPr>
           <w:r>
             <w:drawing>
               <wp:inline distT="0" distB="0" distL="0" distR="0">
-                <wp:extent cx="306000" cy="306000"/>
+                <wp:extent cx="288000" cy="288000"/>
                 <wp:effectExtent t="0" r="0" b="0" l="0"/>
                 <wp:docPr id="1" name="" descr="" title=""/>
                 <wp:cNvGraphicFramePr>
@@ -2947,7 +3179,7 @@
                       <pic:spPr bwMode="auto">
                         <a:xfrm>
                           <a:off x="0" y="0"/>
-                          <a:ext cx="306000" cy="306000"/>
+                          <a:ext cx="288000" cy="288000"/>
                         </a:xfrm>
                         <a:prstGeom prst="rect">
                           <a:avLst/>
@@ -2960,9 +3192,27 @@
             </w:drawing>
           </w:r>
         </w:p>
+      </w:tc>
+      <w:tc>
+        <w:tcPr>
+          <w:tcW w:type="dxa" w:w="2513"/>
+          <w:tcBorders>
+            <w:top w:val="none" w:color="FFFFFF" w:sz="0"/>
+            <w:left w:val="none" w:color="FFFFFF" w:sz="0"/>
+            <w:bottom w:val="none" w:color="FFFFFF" w:sz="0"/>
+            <w:right w:val="none" w:color="FFFFFF" w:sz="0"/>
+          </w:tcBorders>
+          <w:tcMar>
+            <w:top w:type="dxa" w:w="0"/>
+            <w:left w:type="dxa" w:w="0"/>
+            <w:bottom w:type="dxa" w:w="0"/>
+            <w:right w:type="dxa" w:w="0"/>
+          </w:tcMar>
+          <w:vAlign w:val="top"/>
+        </w:tcPr>
         <w:p>
           <w:pPr>
-            <w:spacing w:after="20" w:line="235" w:lineRule="auto"/>
+            <w:spacing w:after="10" w:line="235" w:lineRule="auto"/>
           </w:pPr>
           <w:r>
             <w:rPr>
@@ -2971,12 +3221,12 @@
               <w:sz w:val="17"/>
               <w:szCs w:val="17"/>
             </w:rPr>
-            <w:t xml:space="preserve">Processus de recrutement</w:t>
+            <w:t xml:space="preserve">Contrat</w:t>
           </w:r>
         </w:p>
         <w:p>
           <w:pPr>
-            <w:spacing w:after="20" w:line="235" w:lineRule="auto"/>
+            <w:spacing w:after="30" w:line="235" w:lineRule="auto"/>
           </w:pPr>
           <w:r>
             <w:rPr>
@@ -2985,12 +3235,12 @@
               <w:sz w:val="15"/>
               <w:szCs w:val="15"/>
             </w:rPr>
-            <w:t xml:space="preserve">4 étapes</w:t>
+            <w:t xml:space="preserve">CDI · statut cadre</w:t>
           </w:r>
         </w:p>
         <w:p>
           <w:pPr>
-            <w:spacing w:after="0" w:line="235" w:lineRule="auto"/>
+            <w:spacing w:after="0" w:line="245" w:lineRule="auto"/>
           </w:pPr>
           <w:r>
             <w:rPr>
@@ -2999,35 +3249,58 @@
               <w:sz w:val="14"/>
               <w:szCs w:val="14"/>
             </w:rPr>
-            <w:t xml:space="preserve">Un échange téléphonique, puis trois entretiens au cabinet</w:t>
+            <w:t xml:space="preserve">Avocat(e) salarié(e), forfait jours (218), association future</w:t>
           </w:r>
         </w:p>
       </w:tc>
       <w:tc>
         <w:tcPr>
-          <w:tcW w:type="dxa" w:w="2523"/>
+          <w:tcW w:type="dxa" w:w="340"/>
           <w:tcBorders>
             <w:top w:val="none" w:color="FFFFFF" w:sz="0"/>
-            <w:left w:val="single" w:color="5B7385" w:sz="4"/>
+            <w:left w:val="none" w:color="FFFFFF" w:sz="0"/>
             <w:bottom w:val="none" w:color="FFFFFF" w:sz="0"/>
             <w:right w:val="none" w:color="FFFFFF" w:sz="0"/>
           </w:tcBorders>
           <w:tcMar>
             <w:top w:type="dxa" w:w="0"/>
-            <w:left w:type="dxa" w:w="170"/>
+            <w:left w:type="dxa" w:w="0"/>
             <w:bottom w:type="dxa" w:w="0"/>
-            <w:right w:type="dxa" w:w="110"/>
+            <w:right w:type="dxa" w:w="0"/>
           </w:tcMar>
           <w:vAlign w:val="top"/>
         </w:tcPr>
         <w:p>
           <w:pPr>
-            <w:spacing w:after="70"/>
+            <w:spacing w:after="0" w:line="259" w:lineRule="auto"/>
+          </w:pPr>
+        </w:p>
+      </w:tc>
+      <w:tc>
+        <w:tcPr>
+          <w:tcW w:type="dxa" w:w="624"/>
+          <w:tcBorders>
+            <w:top w:val="none" w:color="FFFFFF" w:sz="0"/>
+            <w:left w:val="none" w:color="FFFFFF" w:sz="0"/>
+            <w:bottom w:val="none" w:color="FFFFFF" w:sz="0"/>
+            <w:right w:val="none" w:color="FFFFFF" w:sz="0"/>
+          </w:tcBorders>
+          <w:tcMar>
+            <w:top w:type="dxa" w:w="0"/>
+            <w:left w:type="dxa" w:w="0"/>
+            <w:bottom w:type="dxa" w:w="0"/>
+            <w:right w:type="dxa" w:w="0"/>
+          </w:tcMar>
+          <w:vAlign w:val="top"/>
+        </w:tcPr>
+        <w:p>
+          <w:pPr>
+            <w:spacing w:after="0" w:line="240" w:lineRule="auto"/>
           </w:pPr>
           <w:r>
             <w:drawing>
               <wp:inline distT="0" distB="0" distL="0" distR="0">
-                <wp:extent cx="306000" cy="306000"/>
+                <wp:extent cx="288000" cy="288000"/>
                 <wp:effectExtent t="0" r="0" b="0" l="0"/>
                 <wp:docPr id="1" name="" descr="" title=""/>
                 <wp:cNvGraphicFramePr>
@@ -3052,7 +3325,7 @@
                       <pic:spPr bwMode="auto">
                         <a:xfrm>
                           <a:off x="0" y="0"/>
-                          <a:ext cx="306000" cy="306000"/>
+                          <a:ext cx="288000" cy="288000"/>
                         </a:xfrm>
                         <a:prstGeom prst="rect">
                           <a:avLst/>
@@ -3065,9 +3338,27 @@
             </w:drawing>
           </w:r>
         </w:p>
+      </w:tc>
+      <w:tc>
+        <w:tcPr>
+          <w:tcW w:type="dxa" w:w="2513"/>
+          <w:tcBorders>
+            <w:top w:val="none" w:color="FFFFFF" w:sz="0"/>
+            <w:left w:val="none" w:color="FFFFFF" w:sz="0"/>
+            <w:bottom w:val="none" w:color="FFFFFF" w:sz="0"/>
+            <w:right w:val="none" w:color="FFFFFF" w:sz="0"/>
+          </w:tcBorders>
+          <w:tcMar>
+            <w:top w:type="dxa" w:w="0"/>
+            <w:left w:type="dxa" w:w="0"/>
+            <w:bottom w:type="dxa" w:w="0"/>
+            <w:right w:type="dxa" w:w="0"/>
+          </w:tcMar>
+          <w:vAlign w:val="top"/>
+        </w:tcPr>
         <w:p>
           <w:pPr>
-            <w:spacing w:after="20" w:line="235" w:lineRule="auto"/>
+            <w:spacing w:after="10" w:line="235" w:lineRule="auto"/>
           </w:pPr>
           <w:r>
             <w:rPr>
@@ -3076,12 +3367,12 @@
               <w:sz w:val="17"/>
               <w:szCs w:val="17"/>
             </w:rPr>
-            <w:t xml:space="preserve">Candidature</w:t>
+            <w:t xml:space="preserve">Recrutement</w:t>
           </w:r>
         </w:p>
         <w:p>
           <w:pPr>
-            <w:spacing w:after="20" w:line="235" w:lineRule="auto"/>
+            <w:spacing w:after="30" w:line="235" w:lineRule="auto"/>
           </w:pPr>
           <w:r>
             <w:rPr>
@@ -3090,12 +3381,12 @@
               <w:sz w:val="15"/>
               <w:szCs w:val="15"/>
             </w:rPr>
-            <w:t xml:space="preserve">CV et lettre de motivation</w:t>
+            <w:t xml:space="preserve">4 étapes</w:t>
           </w:r>
         </w:p>
         <w:p>
           <w:pPr>
-            <w:spacing w:after="0" w:line="235" w:lineRule="auto"/>
+            <w:spacing w:after="0" w:line="245" w:lineRule="auto"/>
           </w:pPr>
           <w:r>
             <w:rPr>
@@ -3104,21 +3395,7 @@
               <w:sz w:val="14"/>
               <w:szCs w:val="14"/>
             </w:rPr>
-            <w:t xml:space="preserve">recrutement@</w:t>
-          </w:r>
-        </w:p>
-        <w:p>
-          <w:pPr>
-            <w:spacing w:after="0" w:line="235" w:lineRule="auto"/>
-          </w:pPr>
-          <w:r>
-            <w:rPr>
-              <w:rFonts w:ascii="Open Sans" w:cs="Open Sans" w:eastAsia="Open Sans" w:hAnsi="Open Sans"/>
-              <w:color w:val="FAF0C7"/>
-              <w:sz w:val="14"/>
-              <w:szCs w:val="14"/>
-            </w:rPr>
-            <w:t xml:space="preserve">victimesetprejudices.fr</w:t>
+            <w:t xml:space="preserve">Un échange téléphonique, puis trois entretiens au cabinet</w:t>
           </w:r>
         </w:p>
       </w:tc>
@@ -3126,19 +3403,17 @@
   </w:tbl>
   <w:p>
     <w:pPr>
-      <w:spacing w:after="283"/>
-    </w:pPr>
-  </w:p>
-  <w:p>
-    <w:pPr>
+      <w:pBdr>
+        <w:top w:val="single" w:color="5B7385" w:sz="4" w:space="6"/>
+      </w:pBdr>
       <w:tabs>
         <w:tab w:val="right" w:pos="10092"/>
       </w:tabs>
-      <w:spacing w:after="0" w:line="259" w:lineRule="auto"/>
+      <w:spacing w:after="0" w:before="283" w:line="259" w:lineRule="auto"/>
     </w:pPr>
     <w:r>
       <w:drawing>
-        <wp:anchor distT="0" distB="0" distL="0" distR="0" simplePos="0" allowOverlap="1" behindDoc="1" locked="1" layoutInCell="0" relativeHeight="79258">
+        <wp:anchor distT="0" distB="0" distL="0" distR="0" simplePos="0" allowOverlap="1" behindDoc="1" locked="1" layoutInCell="0" relativeHeight="100000000">
           <wp:simplePos x="0" y="0"/>
           <wp:positionH relativeFrom="page">
             <wp:posOffset>0</wp:posOffset>
@@ -3191,7 +3466,7 @@
         <w:sz w:val="13"/>
         <w:szCs w:val="13"/>
       </w:rPr>
-      <w:t xml:space="preserve">Offre d’emploi · Victimes &amp; Préjudices Avocats · recrutement@victimesetprejudices.fr</w:t>
+      <w:t xml:space="preserve">Offre d’emploi · Victimes &amp; Préjudices Avocats · victimesetprejudices.fr</w:t>
     </w:r>
     <w:r>
       <w:rPr>
@@ -3217,7 +3492,7 @@
     </w:pPr>
     <w:r>
       <w:drawing>
-        <wp:anchor distT="0" distB="0" distL="0" distR="0" simplePos="0" allowOverlap="1" behindDoc="1" locked="1" layoutInCell="0" relativeHeight="79258">
+        <wp:anchor distT="0" distB="0" distL="0" distR="0" simplePos="0" allowOverlap="1" behindDoc="1" locked="1" layoutInCell="0" relativeHeight="100000000">
           <wp:simplePos x="0" y="0"/>
           <wp:positionH relativeFrom="page">
             <wp:posOffset>0</wp:posOffset>
@@ -3279,16 +3554,7 @@
         <w:sz w:val="13"/>
         <w:szCs w:val="13"/>
       </w:rPr>
-      <w:t xml:space="preserve">	</w:t>
-      <w:fldChar w:fldCharType="begin"/>
-      <w:instrText xml:space="preserve">PAGE</w:instrText>
-      <w:fldChar w:fldCharType="separate"/>
-      <w:fldChar w:fldCharType="end"/>
-      <w:t xml:space="preserve"> / </w:t>
-      <w:fldChar w:fldCharType="begin"/>
-      <w:instrText xml:space="preserve">NUMPAGES</w:instrText>
-      <w:fldChar w:fldCharType="separate"/>
-      <w:fldChar w:fldCharType="end"/>
+      <w:t xml:space="preserve">	1 / 2</w:t>
     </w:r>
   </w:p>
 </w:ftr>

</xml_diff>

<commit_message>
Offre d'emploi contrastée : reprise des modifications de texte du cabinet
Titre « Avocat(e) associé(e) salarié(e) » (24 pt pour tenir sur une ligne),
question de la section 03 raccourcie, tuile CAPA sans mention complémentaire.

Co-Authored-By: Claude Opus 5.5 <noreply@anthropic.com>
Claude-Session: https://claude.ai/code/session_017zLT3dFfTsN6o1Gwcudkmu
</commit_message>
<xml_diff>
--- a/outils/offre-emploi-avocat/Offre_emploi_avocat_version_contrastee.docx
+++ b/outils/offre-emploi-avocat/Offre_emploi_avocat_version_contrastee.docx
@@ -70,17 +70,17 @@
         <w:rPr>
           <w:rFonts w:ascii="Poppins SemiBold" w:cs="Poppins SemiBold" w:eastAsia="Poppins SemiBold" w:hAnsi="Poppins SemiBold"/>
           <w:color w:val="FFFFFF"/>
-          <w:sz w:val="58"/>
-          <w:szCs w:val="58"/>
+          <w:sz w:val="48"/>
+          <w:szCs w:val="48"/>
         </w:rPr>
-        <w:t xml:space="preserve">Avocat(e) </w:t>
+        <w:t xml:space="preserve">Avocat(e) associé(e) </w:t>
       </w:r>
       <w:r>
         <w:rPr>
           <w:rFonts w:ascii="Poppins SemiBold" w:cs="Poppins SemiBold" w:eastAsia="Poppins SemiBold" w:hAnsi="Poppins SemiBold"/>
           <w:color w:val="FCAF19"/>
-          <w:sz w:val="58"/>
-          <w:szCs w:val="58"/>
+          <w:sz w:val="48"/>
+          <w:szCs w:val="48"/>
         </w:rPr>
         <w:t xml:space="preserve">salarié(e)</w:t>
       </w:r>
@@ -1174,7 +1174,7 @@
                 <w:sz w:val="21"/>
                 <w:szCs w:val="21"/>
               </w:rPr>
-              <w:t xml:space="preserve">Vous vous projetez dans un projet d’association ?</w:t>
+              <w:t xml:space="preserve">Un projet d’association ?</w:t>
             </w:r>
           </w:p>
         </w:tc>
@@ -1291,7 +1291,7 @@
                 </w:tcPr>
                 <w:p>
                   <w:pPr>
-                    <w:spacing w:after="30" w:line="240" w:lineRule="auto"/>
+                    <w:spacing w:after="0" w:line="240" w:lineRule="auto"/>
                   </w:pPr>
                   <w:r>
                     <w:rPr>
@@ -1301,20 +1301,6 @@
                       <w:szCs w:val="22"/>
                     </w:rPr>
                     <w:t xml:space="preserve">CAPA</w:t>
-                  </w:r>
-                </w:p>
-                <w:p>
-                  <w:pPr>
-                    <w:spacing w:after="0" w:line="245" w:lineRule="auto"/>
-                  </w:pPr>
-                  <w:r>
-                    <w:rPr>
-                      <w:rFonts w:ascii="Open Sans" w:cs="Open Sans" w:eastAsia="Open Sans" w:hAnsi="Open Sans"/>
-                      <w:color w:val="FFFFFF"/>
-                      <w:sz w:val="15"/>
-                      <w:szCs w:val="15"/>
-                    </w:rPr>
-                    <w:t xml:space="preserve">et inscription à un barreau français</w:t>
                   </w:r>
                 </w:p>
               </w:tc>

</xml_diff>